<commit_message>
Update Naukri resume to v18
Adds business scale the previous version lacked: 500+ users across 30+
business units. Filename unchanged, so bot_chrome.py and ds.py need no
edit.
</commit_message>
<xml_diff>
--- a/naukri_bot/Ashutosh_Sharma_AI_Engineer_Resume.docx
+++ b/naukri_bot/Ashutosh_Sharma_AI_Engineer_Resume.docx
@@ -122,7 +122,7 @@
           <w:color w:val="1A1A1A"/>
           <w:sz w:val="20"/>
         </w:rPr>
-        <w:t>AI Engineer, 4+ years, sole owner of the AI and backend layer behind an enterprise RAG product that answers thousands of queries a day over Confluence, Jira, SharePoint, ITSM and object storage. Retrieval quality is the job: faithfulness doubled, p95 down a third, and nothing ships without passing a regression suite in CI.</w:t>
+        <w:t>AI Engineer, 4+ years, sole owner of the AI and backend layer behind an enterprise RAG product used by 500+ people, answering thousands of queries a day over Confluence, Jira, SharePoint, ITSM and object storage. Retrieval quality is the job: faithfulness doubled, p95 down a third, and nothing ships without passing a regression suite in CI.</w:t>
       </w:r>
     </w:p>
     <w:p>
@@ -333,7 +333,7 @@
           <w:color w:val="1A1A1A"/>
           <w:sz w:val="20"/>
         </w:rPr>
-        <w:t>Owned retrieval and evaluation across a 30k-line FastAPI service. Raised faithfulness from 40% to over 80%, then gated every release on a 100+ question golden set that runs in CI.</w:t>
+        <w:t>Owned retrieval and evaluation across a 30k-line service serving 30+ business units. Raised faithfulness 40% to over 80%, then gated every release on a 100+ question golden set in CI.</w:t>
       </w:r>
     </w:p>
     <w:p>

</xml_diff>

<commit_message>
Correct two unverifiable claims in the resume
- drop 'across all 5 sources' from the tenant-isolation bullet: the defect
  was scoped to markdown-split nodes, not every ingestion source
- drop 'the team runs before merge' from the eval-harness bullet: the
  harness is real, how the team uses it was not verified
</commit_message>
<xml_diff>
--- a/naukri_bot/Ashutosh_Sharma_AI_Engineer_Resume.docx
+++ b/naukri_bot/Ashutosh_Sharma_AI_Engineer_Resume.docx
@@ -397,7 +397,7 @@
           <w:color w:val="1A1A1A"/>
           <w:sz w:val="20"/>
         </w:rPr>
-        <w:t>Built the retrieval eval harness the team runs before merge: golden JSONL replayed through hybrid search and scored on hit-rate@k and MRR, so ranking changes are measured rather than argued.</w:t>
+        <w:t>Built the retrieval eval harness: golden JSONL replayed through hybrid search and scored on hit-rate@k and MRR, so a ranking change is measured rather than argued.</w:t>
       </w:r>
     </w:p>
     <w:p>
@@ -413,7 +413,7 @@
           <w:color w:val="1A1A1A"/>
           <w:sz w:val="20"/>
         </w:rPr>
-        <w:t>Diagnosed a tenant-isolation defect in review: resplit nodes lost their service key and went invisible to filtered retrieval across all 5 sources, then locked the fix behind a regression test.</w:t>
+        <w:t>Diagnosed a tenant-isolation defect in review before it shipped: resplit nodes lost their service key and went invisible to filtered retrieval, then locked the fix behind a regression test.</w:t>
       </w:r>
     </w:p>
     <w:p>

</xml_diff>